<commit_message>
Parte técnica en profundidad para la diapositiva 4
Co-Authored-By: Claude Sonnet 5.5 <noreply@anthropic.com>
</commit_message>
<xml_diff>
--- a/docs/Speech_completo_facil.docx
+++ b/docs/Speech_completo_facil.docx
@@ -19,22 +19,22 @@
     </w:p>
     <w:p>
       <w:r>
-        <w:t xml:space="preserve">"Bienvenidos a Cuna y Canas: los datos abiertos de Madrid, de la cuna a las canas, contados con una historia."</w:t>
-      </w:r>
-    </w:p>
-    <w:p>
-      <w:r>
-        <w:t xml:space="preserve">"Esto lo ha dibujado mi hija Martina, cinco años. Es nuestra casa nueva: tiene un cole al lado, un columpio y aquí, con el bastón, los abuelos. </w:t>
+        <w:t>"Bienvenidos a Cuna y Canas: los datos abiertos de Madrid, de la cuna a las canas, contados con una historia."</w:t>
+      </w:r>
+    </w:p>
+    <w:p>
+      <w:r>
+        <w:t>"Esto lo ha dibujado mi hija Martina, cinco años. Es nuestra casa nueva: tiene un cole al lado, un columpio y aquí, con el bastón, los abuelos. </w:t>
       </w:r>
       <w:r>
         <w:rPr>
           <w:i/>
           <w:iCs/>
         </w:rPr>
-        <w:t xml:space="preserve">(pausa)</w:t>
-      </w:r>
-      <w:r>
-        <w:t xml:space="preserve"> Solo tiene un problema: no sabemos dónde está esa casa." "Somos mi marido, Martina, yo, el bebé que viene en septiembre —que ya tiene más ropa que yo— y mis padres, que quieren venirse cerca, pero con condiciones: mi madre quiere un hogar de mayores para jugar al dominó con sus amigas, y mi padre, que anda regular, un centro de día por las mañanas. Y los dos lo tienen claro: a una residencia, todavía no."</w:t>
+        <w:t>(pausa)</w:t>
+      </w:r>
+      <w:r>
+        <w:t> Solo tiene un problema: no sabemos dónde está esa casa." "Somos mi marido, Martina, yo, el bebé que viene en septiembre —que ya tiene más ropa que yo— y mis padres, que quieren venirse cerca, pero con condiciones: mi madre quiere un hogar de mayores para jugar al dominó con sus amigas, y mi padre, que anda regular, un centro de día por las mañanas. Y los dos lo tienen claro: a una residencia, todavía no."</w:t>
       </w:r>
     </w:p>
     <w:p/>
@@ -206,10 +206,7 @@
         <w:t>SALE</w:t>
       </w:r>
       <w:r>
-        <w:t>:</w:t>
-      </w:r>
-      <w:r>
-        <w:t xml:space="preserve"> </w:t>
+        <w:t xml:space="preserve">: </w:t>
       </w:r>
       <w:r>
         <w:rPr>
@@ -293,17 +290,17 @@
         </w:rPr>
       </w:pPr>
       <w:r>
-        <w:t xml:space="preserve">"Tres finalistas. Mi cuñado, que siempre opina, dice: 'Tres Cantos es muchísimo mejor'. En renta tiene razón: </w:t>
-      </w:r>
-      <w:r>
-        <w:rPr>
-          <w:b/>
-          <w:bCs/>
-        </w:rPr>
-        <w:t xml:space="preserve">30.280 € por habitante, frente a 19.413 en Getafe</w:t>
-      </w:r>
-      <w:r>
-        <w:t xml:space="preserve">. Pero yo no busco el sitio más rico: busco el que tenga lo que necesita mi familia."</w:t>
+        <w:t>"Tres finalistas. Mi cuñado, que siempre opina, dice: 'Tres Cantos es muchísimo mejor'. En renta tiene razón: </w:t>
+      </w:r>
+      <w:r>
+        <w:rPr>
+          <w:b/>
+          <w:bCs/>
+        </w:rPr>
+        <w:t>30.280 € por habitante, frente a 19.413 en Getafe</w:t>
+      </w:r>
+      <w:r>
+        <w:t>. Pero yo no busco el sitio más rico: busco el que tenga lo que necesita mi familia."</w:t>
       </w:r>
       <w:r>
         <w:rPr>
@@ -314,6 +311,9 @@
     </w:p>
     <w:p>
       <w:r>
+        <w:rPr>
+          <w:noProof/>
+        </w:rPr>
         <w:lastRenderedPageBreak/>
         <w:drawing>
           <wp:inline distT="0" distB="0" distL="0" distR="0" wp14:anchorId="75228A5D" wp14:editId="0F69E9E8">
@@ -354,37 +354,27 @@
     </w:p>
     <w:p>
       <w:r>
-        <w:t xml:space="preserve">"Tres Cantos: 54.000 vecinos con cinco escuelas infantiles públicas y dos centros de salud. Alcalá: el hospital a dos kilómetros. Getafe: Metro 3, Metro 12 y dos Cercanías, abono B1… y, ojo, </w:t>
-      </w:r>
-      <w:r>
-        <w:rPr>
-          <w:b/>
-          <w:bCs/>
-        </w:rPr>
-        <w:t xml:space="preserve">2,2 plazas de residencia por cada 100 mayores</w:t>
-      </w:r>
-      <w:r>
-        <w:t xml:space="preserve">: la mitad que la media de la Comunidad. </w:t>
+        <w:t>"Tres Cantos: 54.000 vecinos con cinco escuelas infantiles públicas y dos centros de salud. Alcalá: el hospital a dos kilómetros. Getafe: Metro 3, Metro 12 y dos Cercanías, abono B1… y, ojo, </w:t>
+      </w:r>
+      <w:r>
+        <w:rPr>
+          <w:b/>
+          <w:bCs/>
+        </w:rPr>
+        <w:t>2,2 plazas de residencia por cada 100 mayores</w:t>
+      </w:r>
+      <w:r>
+        <w:t>: la mitad que la media de la Comunidad. </w:t>
       </w:r>
       <w:r>
         <w:rPr>
           <w:i/>
           <w:iCs/>
         </w:rPr>
-        <w:t xml:space="preserve">(guiño al público)</w:t>
-      </w:r>
-      <w:r>
-        <w:t xml:space="preserve"> Me lo apunto: para mis padres, centro de día sí; residencia, más adelante." "Elegimos Getafe: Metro y 21 autobuses a Madrid para mi marido, 15 escuelas infantiles públicas para el bebé y centros de día para mi padre. Tres Cantos tiene solo dos centros de salud para 54.000 vecinos, y Alcalá, solo 6 autobuses directos a Madrid.</w:t>
-      </w:r>
-      <w:r>
-        <w:rPr>
-          <w:b/>
-          <w:bCs/>
-        </w:rPr>
-        <w:t xml:space="preserve"/>
-      </w:r>
-      <w:r>
-        <w:t xml:space="preserve">"</w:t>
+        <w:t>(guiño al público)</w:t>
+      </w:r>
+      <w:r>
+        <w:t> Me lo apunto: para mis padres, centro de día sí; residencia, más adelante." "Elegimos Getafe: Metro y 21 autobuses a Madrid para mi marido, 15 escuelas infantiles públicas para el bebé y centros de día para mi padre. Tres Cantos tiene solo dos centros de salud para 54.000 vecinos, y Alcalá, solo 6 autobuses directos a Madrid."</w:t>
       </w:r>
     </w:p>
     <w:p/>
@@ -455,7 +445,7 @@
         <w:rPr>
           <w:color w:val="156082" w:themeColor="accent1"/>
         </w:rPr>
-        <w:t xml:space="preserve">SALE</w:t>
+        <w:t>SALE</w:t>
       </w:r>
       <w:r>
         <w:t xml:space="preserve">: </w:t>
@@ -465,17 +455,17 @@
           <w:b/>
           <w:bCs/>
         </w:rPr>
-        <w:t xml:space="preserve">5 de 6</w:t>
-      </w:r>
-      <w:r>
-        <w:t xml:space="preserve"> a menos de 10 min: 2 escuelas infantiles públicas, 6 colegios, centro de salud y centro de día. Solo falta el hogar de mayores: </w:t>
+        <w:t>5 de 6</w:t>
+      </w:r>
+      <w:r>
+        <w:t> a menos de 10 min: 2 escuelas infantiles públicas, 6 colegios, centro de salud y centro de día. Solo falta el hogar de mayores: </w:t>
       </w:r>
       <w:r>
         <w:rPr>
           <w:i/>
           <w:iCs/>
         </w:rPr>
-        <w:t xml:space="preserve">"centro de día para mi padre, sí; para el dominó de mi madre, falta un hogar de mayores cerca"</w:t>
+        <w:t>"centro de día para mi padre, sí; para el dominó de mi madre, falta un hogar de mayores cerca"</w:t>
       </w:r>
     </w:p>
     <w:p>
@@ -575,6 +565,7 @@
         <w:rPr>
           <w:color w:val="156082" w:themeColor="accent1"/>
         </w:rPr>
+        <w:lastRenderedPageBreak/>
         <w:t>SALE</w:t>
       </w:r>
       <w:r>
@@ -600,38 +591,7 @@
     </w:p>
     <w:p>
       <w:r>
-        <w:lastRenderedPageBreak/>
-        <w:t xml:space="preserve">"En El Rosón todavía no ha llegado todo el mundo: llegamos antes que los demás, y ya tiene casi todo lo que buscamos. ¿Se va a revalorizar el barrio? No lo sé: Cuna y Canas no usa precios de pisos. Lo que sí sé es qué va a hacer falta cuando llegue esa gente: colegios, centros de salud…</w:t>
-      </w:r>
-      <w:r>
-        <w:rPr>
-          <w:b/>
-          <w:bCs/>
-        </w:rPr>
-        <w:t xml:space="preserve"/>
-      </w:r>
-      <w:r>
-        <w:t xml:space="preserve"/>
-      </w:r>
-      <w:r>
-        <w:rPr>
-          <w:b/>
-          <w:bCs/>
-        </w:rPr>
-        <w:t xml:space="preserve"/>
-      </w:r>
-      <w:r>
-        <w:t xml:space="preserve"/>
-      </w:r>
-      <w:r>
-        <w:rPr>
-          <w:i/>
-          <w:iCs/>
-        </w:rPr>
-        <w:t xml:space="preserve"/>
-      </w:r>
-      <w:r>
-        <w:t xml:space="preserve">"</w:t>
+        <w:t>"En El Rosón todavía no ha llegado todo el mundo: llegamos antes que los demás, y ya tiene casi todo lo que buscamos. ¿Se va a revalorizar el barrio? No lo sé: Cuna y Canas no usa precios de pisos. Lo que sí sé es qué va a hacer falta cuando llegue esa gente: colegios, centros de salud…"</w:t>
       </w:r>
     </w:p>
     <w:p/>
@@ -833,14 +793,14 @@
         </w:rPr>
       </w:pPr>
       <w:r>
-        <w:t xml:space="preserve">Leer la frase de arriba. Señalar los círculos grises: </w:t>
+        <w:t>Leer la frase de arriba. Señalar los círculos grises: </w:t>
       </w:r>
       <w:r>
         <w:rPr>
           <w:i/>
           <w:iCs/>
         </w:rPr>
-        <w:t xml:space="preserve">"cada círculo es una zona de unos 2.000 vecinos; cuanto más grande, más niños en edad de cole viven allí. Esa es la demanda: dónde están los niños que necesitan plaza."</w:t>
+        <w:t>"cada círculo es una zona de unos 2.000 vecinos; cuanto más grande, más niños en edad de cole viven allí. Esa es la demanda: dónde están los niños que necesitan plaza."</w:t>
       </w:r>
     </w:p>
     <w:p>
@@ -890,7 +850,6 @@
     </w:p>
     <w:p>
       <w:r>
-        <w:lastRenderedPageBreak/>
         <w:t>"¿Y si cambio lo que consideramos 'cerca'? A cinco minutos andando harían falta </w:t>
       </w:r>
       <w:r>
@@ -1008,6 +967,7 @@
     </w:p>
     <w:p>
       <w:r>
+        <w:lastRenderedPageBreak/>
         <w:t>"¿Y si solo hay presupuesto para dos? Lo quito y me dice </w:t>
       </w:r>
       <w:r>
@@ -1066,31 +1026,12 @@
           <w:b/>
           <w:bCs/>
         </w:rPr>
-        <w:t xml:space="preserve">Residencia de </w:t>
-      </w:r>
-      <w:proofErr w:type="spellStart"/>
-      <w:r>
-        <w:rPr>
-          <w:b/>
-          <w:bCs/>
-        </w:rPr>
-        <w:t>mayores</w:t>
-      </w:r>
-      <w:proofErr w:type="spellEnd"/>
-    </w:p>
-    <w:p>
-      <w:r>
-        <w:t xml:space="preserve">"Y lo de los padres de Laura, aunque no la necesiten hoy: Getafe tiene 2,2 plazas de residencia por cada 100 mayores, y la media de la Comunidad es 4,3. Faltan unas 780 plazas. El Ayuntamiento tiene que planificarlo ya.</w:t>
-      </w:r>
-      <w:r>
-        <w:rPr>
-          <w:b/>
-          <w:bCs/>
-        </w:rPr>
-        <w:t xml:space="preserve"/>
-      </w:r>
-      <w:r>
-        <w:t xml:space="preserve">"</w:t>
+        <w:t>Residencia de mayores</w:t>
+      </w:r>
+    </w:p>
+    <w:p>
+      <w:r>
+        <w:t>"Y lo de los padres de Laura, aunque no la necesiten hoy: Getafe tiene 2,2 plazas de residencia por cada 100 mayores, y la media de la Comunidad es 4,3. Faltan unas 780 plazas. El Ayuntamiento tiene que planificarlo ya."</w:t>
       </w:r>
     </w:p>
     <w:p>
@@ -1098,66 +1039,59 @@
         <w:rPr>
           <w:color w:val="156082" w:themeColor="accent1"/>
         </w:rPr>
-        <w:t xml:space="preserve">SALE</w:t>
+        <w:t>SALE</w:t>
       </w:r>
       <w:r>
         <w:t xml:space="preserve">: </w:t>
       </w:r>
       <w:r>
-        <w:t xml:space="preserve">Titular: Faltan unas 776 plazas</w:t>
-      </w:r>
+        <w:t>Titular: Faltan unas 776 plazas</w:t>
+      </w:r>
+    </w:p>
+    <w:p>
+      <w:r>
+        <w:rPr>
+          <w:b/>
+          <w:bCs/>
+        </w:rPr>
+        <w:t>Carmen:</w:t>
+      </w:r>
+      <w:r>
+        <w:t> "Laura elige con información. Yo planifico antes de que lleguen. </w:t>
+      </w:r>
+      <w:r>
+        <w:rPr>
+          <w:b/>
+          <w:bCs/>
+        </w:rPr>
+        <w:t>Los mismos datos, dos lecturas.</w:t>
+      </w:r>
+      <w:r>
+        <w:t>"</w:t>
+      </w:r>
+    </w:p>
+    <w:p>
+      <w:pPr>
+        <w:rPr>
+          <w:b/>
+          <w:bCs/>
+        </w:rPr>
+      </w:pPr>
+      <w:r>
+        <w:rPr>
+          <w:b/>
+          <w:bCs/>
+        </w:rPr>
+        <w:t>LA PRESENTACIÓN (5:00 – 10:00)</w:t>
+      </w:r>
+    </w:p>
+    <w:p>
       <w:r>
         <w:rPr>
           <w:i/>
           <w:iCs/>
         </w:rPr>
-        <w:t xml:space="preserve"/>
-      </w:r>
-    </w:p>
-    <w:p>
-      <w:r>
-        <w:rPr>
-          <w:b/>
-          <w:bCs/>
-        </w:rPr>
-        <w:t>Carmen:</w:t>
-      </w:r>
-      <w:r>
-        <w:t> "Laura elige con información. Yo planifico antes de que lleguen. </w:t>
-      </w:r>
-      <w:r>
-        <w:rPr>
-          <w:b/>
-          <w:bCs/>
-        </w:rPr>
-        <w:t>Los mismos datos, dos lecturas.</w:t>
-      </w:r>
-      <w:r>
-        <w:t>"</w:t>
-      </w:r>
-    </w:p>
-    <w:p>
-      <w:pPr>
-        <w:rPr>
-          <w:b/>
-          <w:bCs/>
-        </w:rPr>
-      </w:pPr>
-      <w:r>
-        <w:rPr>
-          <w:b/>
-          <w:bCs/>
-        </w:rPr>
-        <w:t xml:space="preserve">LA PRESENTACIÓN (5:00 – 10:00)</w:t>
-      </w:r>
-    </w:p>
-    <w:p>
-      <w:r>
-        <w:rPr>
-          <w:i/>
-          <w:iCs/>
-        </w:rPr>
-        <w:t xml:space="preserve">Aquí se acaba el rol play: Laura y Carmen salen del personaje y hablan ellas. Lenguaje sencillo, frases cortas, como si se lo explicáramos a un niño. Diapositivas del PDF "Final MAD Open Data Challenge 2026" (la portada ya estaba puesta al empezar).</w:t>
+        <w:t>Aquí se acaba el rol play: Laura y Carmen salen del personaje y hablan ellas. Lenguaje sencillo, frases cortas, como si se lo explicáramos a un niño. Diapositivas del PDF "Final MAD Open Data Challenge 2026" (la portada ya estaba puesta al empezar).</w:t>
       </w:r>
     </w:p>
     <w:p/>
@@ -1173,7 +1107,7 @@
           <w:b/>
           <w:bCs/>
         </w:rPr>
-        <w:t xml:space="preserve">5:00 – 5:20 · Bienvenida (nosotras, ya sin personaje)</w:t>
+        <w:t>5:00 – 5:20 · Bienvenida (nosotras, ya sin personaje)</w:t>
       </w:r>
     </w:p>
     <w:p>
@@ -1187,32 +1121,29 @@
         <w:rPr>
           <w:color w:val="156082" w:themeColor="accent1"/>
         </w:rPr>
-        <w:t xml:space="preserve">PULSAR</w:t>
-      </w:r>
-      <w:r>
-        <w:t xml:space="preserve">: </w:t>
-      </w:r>
-      <w:r>
-        <w:t xml:space="preserve">Cerrar el navegador y pasar a la diapositiva 1 (Problema)</w:t>
-      </w:r>
-    </w:p>
-    <w:p>
-      <w:r>
-        <w:rPr>
-          <w:b/>
-          <w:bCs/>
-        </w:rPr>
-        <w:t xml:space="preserve">Lucía:</w:t>
-      </w:r>
-      <w:r>
-        <w:t xml:space="preserve"> "</w:t>
-      </w:r>
-      <w:r>
-        <w:rPr>
-          <w:b/>
-          <w:bCs/>
-        </w:rPr>
-        <w:t xml:space="preserve">Bienvenidos a Cuna y Canas.</w:t>
+        <w:t>PULSAR</w:t>
+      </w:r>
+      <w:r>
+        <w:t>: Cerrar el navegador y pasar a la diapositiva 1 (Problema)</w:t>
+      </w:r>
+    </w:p>
+    <w:p>
+      <w:r>
+        <w:rPr>
+          <w:b/>
+          <w:bCs/>
+        </w:rPr>
+        <w:t>Lucía:</w:t>
+      </w:r>
+      <w:r>
+        <w:t> "</w:t>
+      </w:r>
+      <w:r>
+        <w:rPr>
+          <w:b/>
+          <w:bCs/>
+        </w:rPr>
+        <w:t>Bienvenidos a Cuna y Canas.</w:t>
       </w:r>
       <w:r>
         <w:t xml:space="preserve"> Hasta aquí, Laura y Carmen. Ahora somos nosotras: </w:t>
@@ -1222,38 +1153,27 @@
           <w:b/>
           <w:bCs/>
         </w:rPr>
-        <w:t xml:space="preserve">Lucía…</w:t>
-      </w:r>
-      <w:r>
-        <w:t xml:space="preserve">"</w:t>
-      </w:r>
-    </w:p>
-    <w:p>
-      <w:r>
-        <w:rPr>
-          <w:b/>
-          <w:bCs/>
-        </w:rPr>
-        <w:t xml:space="preserve">Claudia:</w:t>
-      </w:r>
-      <w:r>
-        <w:t xml:space="preserve"> "</w:t>
-      </w:r>
-      <w:r>
-        <w:t xml:space="preserve">…y </w:t>
-      </w:r>
-      <w:r>
-        <w:rPr>
-          <w:b/>
-          <w:bCs/>
-        </w:rPr>
-        <w:t xml:space="preserve">Claudia Agromayor</w:t>
-      </w:r>
-      <w:r>
-        <w:t xml:space="preserve">. Y vamos a contaros, con palabras sencillas, cómo funciona por dentro lo que acabáis de ver.</w:t>
-      </w:r>
-      <w:r>
-        <w:t xml:space="preserve">"</w:t>
+        <w:t>Lucía</w:t>
+      </w:r>
+      <w:r>
+        <w:rPr>
+          <w:b/>
+          <w:bCs/>
+        </w:rPr>
+        <w:t xml:space="preserve"> Cordero </w:t>
+      </w:r>
+      <w:r>
+        <w:t xml:space="preserve">y </w:t>
+      </w:r>
+      <w:r>
+        <w:rPr>
+          <w:b/>
+          <w:bCs/>
+        </w:rPr>
+        <w:t>Claudia Agromayor</w:t>
+      </w:r>
+      <w:r>
+        <w:t>. Y vamos a contaros, con palabras sencillas, cómo funciona por dentro lo que acabáis de ver."</w:t>
       </w:r>
     </w:p>
     <w:p/>
@@ -1269,29 +1189,26 @@
           <w:b/>
           <w:bCs/>
         </w:rPr>
-        <w:t xml:space="preserve">5:20 – 6:00 · El problema (diapositiva 1 · Lucía)</w:t>
-      </w:r>
-    </w:p>
-    <w:p>
-      <w:r>
-        <w:rPr>
-          <w:b/>
-          <w:bCs/>
-        </w:rPr>
-        <w:t xml:space="preserve">Lucía:</w:t>
-      </w:r>
-      <w:r>
-        <w:t xml:space="preserve"> "</w:t>
-      </w:r>
-      <w:r>
-        <w:t xml:space="preserve">Imaginad que un barrio nuevo es una clase que se va llenando de niños. Hacen falta sillas, una profesora y un patio. Pues en Madrid se van a construir muchísimas casas. El plan prevé más de </w:t>
-      </w:r>
-      <w:r>
-        <w:rPr>
-          <w:b/>
-          <w:bCs/>
-        </w:rPr>
-        <w:t xml:space="preserve">513.000</w:t>
+        <w:t>5:20 – 6:00 · El problema (diapositiva 1 · Lucía)</w:t>
+      </w:r>
+    </w:p>
+    <w:p>
+      <w:r>
+        <w:rPr>
+          <w:b/>
+          <w:bCs/>
+        </w:rPr>
+        <w:t>Lucía:</w:t>
+      </w:r>
+      <w:r>
+        <w:t xml:space="preserve"> "Imaginad que un barrio nuevo es una clase que se va llenando de niños. Hacen falta sillas, una profesora y un patio. Pues en Madrid se van a construir muchísimas casas. El plan prevé más de </w:t>
+      </w:r>
+      <w:r>
+        <w:rPr>
+          <w:b/>
+          <w:bCs/>
+        </w:rPr>
+        <w:t>513.000</w:t>
       </w:r>
       <w:r>
         <w:t xml:space="preserve">, y según el catastro, que es el registro de las casas, </w:t>
@@ -1301,35 +1218,29 @@
           <w:b/>
           <w:bCs/>
         </w:rPr>
-        <w:t xml:space="preserve">unas 222.000 todavía no están hechas</w:t>
-      </w:r>
-      <w:r>
-        <w:t xml:space="preserve">.</w:t>
-      </w:r>
-      <w:r>
-        <w:t xml:space="preserve">"</w:t>
-      </w:r>
-    </w:p>
-    <w:p>
-      <w:r>
-        <w:rPr>
-          <w:b/>
-          <w:bCs/>
-        </w:rPr>
-        <w:t xml:space="preserve">Lucía:</w:t>
-      </w:r>
-      <w:r>
-        <w:t xml:space="preserve"> "</w:t>
-      </w:r>
-      <w:r>
-        <w:t xml:space="preserve">En esas casas vivirán entre </w:t>
-      </w:r>
-      <w:r>
-        <w:rPr>
-          <w:b/>
-          <w:bCs/>
-        </w:rPr>
-        <w:t xml:space="preserve">medio millón y 700.000 personas</w:t>
+        <w:t>unas 222.000 todavía no están hechas</w:t>
+      </w:r>
+      <w:r>
+        <w:t>."</w:t>
+      </w:r>
+    </w:p>
+    <w:p>
+      <w:r>
+        <w:rPr>
+          <w:b/>
+          <w:bCs/>
+        </w:rPr>
+        <w:t>Lucía:</w:t>
+      </w:r>
+      <w:r>
+        <w:t xml:space="preserve"> "En esas casas vivirán entre </w:t>
+      </w:r>
+      <w:r>
+        <w:rPr>
+          <w:b/>
+          <w:bCs/>
+        </w:rPr>
+        <w:t>medio millón y 700.000 personas</w:t>
       </w:r>
       <w:r>
         <w:t xml:space="preserve">. Necesitarán entre </w:t>
@@ -1339,7 +1250,7 @@
           <w:b/>
           <w:bCs/>
         </w:rPr>
-        <w:t xml:space="preserve">38.000 y 93.000 plazas de colegio</w:t>
+        <w:t>38.000 y 93.000 plazas de colegio</w:t>
       </w:r>
       <w:r>
         <w:t xml:space="preserve"> y unos </w:t>
@@ -1349,35 +1260,29 @@
           <w:b/>
           <w:bCs/>
         </w:rPr>
-        <w:t xml:space="preserve">19 a 27 centros de salud</w:t>
-      </w:r>
-      <w:r>
-        <w:t xml:space="preserve">.</w:t>
-      </w:r>
-      <w:r>
-        <w:t xml:space="preserve">"</w:t>
-      </w:r>
-    </w:p>
-    <w:p>
-      <w:r>
-        <w:rPr>
-          <w:b/>
-          <w:bCs/>
-        </w:rPr>
-        <w:t xml:space="preserve">Lucía:</w:t>
-      </w:r>
-      <w:r>
-        <w:t xml:space="preserve"> "</w:t>
-      </w:r>
-      <w:r>
-        <w:t xml:space="preserve">¿Y el problema? Que primero llegan las casas, y los colegios llegan tarde. En </w:t>
-      </w:r>
-      <w:r>
-        <w:rPr>
-          <w:b/>
-          <w:bCs/>
-        </w:rPr>
-        <w:t xml:space="preserve">Los Molinos</w:t>
+        <w:t>19 a 27 centros de salud</w:t>
+      </w:r>
+      <w:r>
+        <w:t>."</w:t>
+      </w:r>
+    </w:p>
+    <w:p>
+      <w:r>
+        <w:rPr>
+          <w:b/>
+          <w:bCs/>
+        </w:rPr>
+        <w:t>Lucía:</w:t>
+      </w:r>
+      <w:r>
+        <w:t xml:space="preserve"> "¿Y el problema? Que primero llegan las casas, y los colegios llegan tarde. En </w:t>
+      </w:r>
+      <w:r>
+        <w:rPr>
+          <w:b/>
+          <w:bCs/>
+        </w:rPr>
+        <w:t>Los Molinos</w:t>
       </w:r>
       <w:r>
         <w:t xml:space="preserve"> viven 11.473 personas, y el </w:t>
@@ -1387,17 +1292,21 @@
           <w:b/>
           <w:bCs/>
         </w:rPr>
-        <w:t xml:space="preserve">72 %</w:t>
-      </w:r>
-      <w:r>
-        <w:t xml:space="preserve"> del suelo que se guardó para colegios y centros de salud sigue </w:t>
-      </w:r>
-      <w:r>
-        <w:rPr>
-          <w:b/>
-          <w:bCs/>
-        </w:rPr>
-        <w:t xml:space="preserve">vacío</w:t>
+        <w:t>72 %</w:t>
+      </w:r>
+      <w:r>
+        <w:t xml:space="preserve"> del suelo que se guardó para </w:t>
+      </w:r>
+      <w:r>
+        <w:lastRenderedPageBreak/>
+        <w:t xml:space="preserve">colegios y centros de salud sigue </w:t>
+      </w:r>
+      <w:r>
+        <w:rPr>
+          <w:b/>
+          <w:bCs/>
+        </w:rPr>
+        <w:t>vacío</w:t>
       </w:r>
       <w:r>
         <w:t xml:space="preserve">. Hay sitio. Lo que falta es decidir </w:t>
@@ -1407,7 +1316,7 @@
           <w:b/>
           <w:bCs/>
         </w:rPr>
-        <w:t xml:space="preserve">dónde</w:t>
+        <w:t>dónde</w:t>
       </w:r>
       <w:r>
         <w:t xml:space="preserve"> y </w:t>
@@ -1417,13 +1326,10 @@
           <w:b/>
           <w:bCs/>
         </w:rPr>
-        <w:t xml:space="preserve">cuándo</w:t>
-      </w:r>
-      <w:r>
-        <w:t xml:space="preserve">.</w:t>
-      </w:r>
-      <w:r>
-        <w:t xml:space="preserve">"</w:t>
+        <w:t>cuándo</w:t>
+      </w:r>
+      <w:r>
+        <w:t>."</w:t>
       </w:r>
     </w:p>
     <w:p/>
@@ -1439,7 +1345,7 @@
           <w:b/>
           <w:bCs/>
         </w:rPr>
-        <w:t xml:space="preserve">6:00 – 6:40 · Qué es Cuna y Canas (diapositiva 2 · Claudia)</w:t>
+        <w:t>6:00 – 6:40 · Qué es Cuna y Canas (diapositiva 2 · Claudia)</w:t>
       </w:r>
     </w:p>
     <w:p>
@@ -1453,63 +1359,65 @@
         <w:rPr>
           <w:color w:val="156082" w:themeColor="accent1"/>
         </w:rPr>
-        <w:t xml:space="preserve">PULSAR</w:t>
-      </w:r>
-      <w:r>
-        <w:t xml:space="preserve">: </w:t>
-      </w:r>
-      <w:r>
-        <w:t xml:space="preserve">Diapositiva 2, Qué es Cuna y Canas</w:t>
-      </w:r>
-    </w:p>
-    <w:p>
-      <w:r>
-        <w:rPr>
-          <w:b/>
-          <w:bCs/>
-        </w:rPr>
-        <w:t xml:space="preserve">Claudia:</w:t>
-      </w:r>
-      <w:r>
-        <w:t xml:space="preserve"> "</w:t>
-      </w:r>
-      <w:r>
-        <w:t xml:space="preserve">Cuna y Canas es una web con </w:t>
-      </w:r>
-      <w:r>
-        <w:rPr>
-          <w:b/>
-          <w:bCs/>
-        </w:rPr>
-        <w:t xml:space="preserve">tres pantallas</w:t>
-      </w:r>
-      <w:r>
-        <w:t xml:space="preserve"> que usan los mismos datos.</w:t>
-      </w:r>
-      <w:r>
-        <w:t xml:space="preserve">"</w:t>
-      </w:r>
-    </w:p>
-    <w:p>
-      <w:r>
-        <w:rPr>
-          <w:b/>
-          <w:bCs/>
-        </w:rPr>
-        <w:t xml:space="preserve">Claudia:</w:t>
-      </w:r>
-      <w:r>
-        <w:t xml:space="preserve"> "</w:t>
-      </w:r>
-      <w:r>
-        <w:t xml:space="preserve">La primera, </w:t>
-      </w:r>
-      <w:r>
-        <w:rPr>
-          <w:b/>
-          <w:bCs/>
-        </w:rPr>
-        <w:t xml:space="preserve">¿Dónde vivir?</w:t>
+        <w:t>PULSAR</w:t>
+      </w:r>
+      <w:r>
+        <w:t>: Diapositiva 2, Qué es Cuna y Canas</w:t>
+      </w:r>
+    </w:p>
+    <w:p>
+      <w:r>
+        <w:rPr>
+          <w:b/>
+          <w:bCs/>
+        </w:rPr>
+        <w:t>Lucia</w:t>
+      </w:r>
+      <w:r>
+        <w:rPr>
+          <w:b/>
+          <w:bCs/>
+        </w:rPr>
+        <w:t>:</w:t>
+      </w:r>
+      <w:r>
+        <w:t xml:space="preserve"> "Cuna y Canas es una web con </w:t>
+      </w:r>
+      <w:r>
+        <w:rPr>
+          <w:b/>
+          <w:bCs/>
+        </w:rPr>
+        <w:t>tres pantallas</w:t>
+      </w:r>
+      <w:r>
+        <w:t xml:space="preserve"> que usan los mismos datos."</w:t>
+      </w:r>
+    </w:p>
+    <w:p>
+      <w:r>
+        <w:rPr>
+          <w:b/>
+          <w:bCs/>
+        </w:rPr>
+        <w:t>Lucia</w:t>
+      </w:r>
+      <w:r>
+        <w:rPr>
+          <w:b/>
+          <w:bCs/>
+        </w:rPr>
+        <w:t>:</w:t>
+      </w:r>
+      <w:r>
+        <w:t xml:space="preserve"> "La primera, </w:t>
+      </w:r>
+      <w:r>
+        <w:rPr>
+          <w:b/>
+          <w:bCs/>
+        </w:rPr>
+        <w:t>¿Dónde vivir?</w:t>
       </w:r>
       <w:r>
         <w:t xml:space="preserve">, es para una familia: dices qué necesitas y te ordena los 179 municipios. La segunda, </w:t>
@@ -1519,7 +1427,7 @@
           <w:b/>
           <w:bCs/>
         </w:rPr>
-        <w:t xml:space="preserve">Barrios</w:t>
+        <w:t>Barrios</w:t>
       </w:r>
       <w:r>
         <w:t xml:space="preserve">, te enseña qué tienes cerca andando, a 5, 10 o 20 minutos. Y la tercera, </w:t>
@@ -1529,35 +1437,36 @@
           <w:b/>
           <w:bCs/>
         </w:rPr>
-        <w:t xml:space="preserve">Planificar</w:t>
-      </w:r>
-      <w:r>
-        <w:t xml:space="preserve">, es para quien decide, como Carmen: cuántos colegios hacen falta, cuándo y dónde.</w:t>
-      </w:r>
-      <w:r>
-        <w:t xml:space="preserve">"</w:t>
-      </w:r>
-    </w:p>
-    <w:p>
-      <w:r>
-        <w:rPr>
-          <w:b/>
-          <w:bCs/>
-        </w:rPr>
-        <w:t xml:space="preserve">Claudia:</w:t>
-      </w:r>
-      <w:r>
-        <w:t xml:space="preserve"> "</w:t>
-      </w:r>
-      <w:r>
-        <w:t xml:space="preserve">Los demás te dicen dónde vivir </w:t>
-      </w:r>
-      <w:r>
-        <w:rPr>
-          <w:b/>
-          <w:bCs/>
-        </w:rPr>
-        <w:t xml:space="preserve">hoy</w:t>
+        <w:t>Planificar</w:t>
+      </w:r>
+      <w:r>
+        <w:t>, es para quien decide, como Carmen: cuántos colegios hacen falta, cuándo y dónde."</w:t>
+      </w:r>
+    </w:p>
+    <w:p>
+      <w:r>
+        <w:rPr>
+          <w:b/>
+          <w:bCs/>
+        </w:rPr>
+        <w:t>Lucia</w:t>
+      </w:r>
+      <w:r>
+        <w:rPr>
+          <w:b/>
+          <w:bCs/>
+        </w:rPr>
+        <w:t>:</w:t>
+      </w:r>
+      <w:r>
+        <w:t xml:space="preserve"> "Los demás te dicen dónde vivir </w:t>
+      </w:r>
+      <w:r>
+        <w:rPr>
+          <w:b/>
+          <w:bCs/>
+        </w:rPr>
+        <w:t>hoy</w:t>
       </w:r>
       <w:r>
         <w:t xml:space="preserve">. Nosotras te decimos qué va a faltar </w:t>
@@ -1567,13 +1476,10 @@
           <w:b/>
           <w:bCs/>
         </w:rPr>
-        <w:t xml:space="preserve">mañana</w:t>
-      </w:r>
-      <w:r>
-        <w:t xml:space="preserve">, y dónde ponerlo.</w:t>
-      </w:r>
-      <w:r>
-        <w:t xml:space="preserve">"</w:t>
+        <w:t>mañana</w:t>
+      </w:r>
+      <w:r>
+        <w:t>, y dónde ponerlo."</w:t>
       </w:r>
     </w:p>
     <w:p/>
@@ -1589,7 +1495,7 @@
           <w:b/>
           <w:bCs/>
         </w:rPr>
-        <w:t xml:space="preserve">6:40 – 7:25 · De dónde salen los datos (diapositiva 3 · Lucía)</w:t>
+        <w:t>6:40 – 7:25 · De dónde salen los datos (diapositiva 3 · Lucía)</w:t>
       </w:r>
     </w:p>
     <w:p>
@@ -1603,97 +1509,76 @@
         <w:rPr>
           <w:color w:val="156082" w:themeColor="accent1"/>
         </w:rPr>
-        <w:t xml:space="preserve">PULSAR</w:t>
-      </w:r>
-      <w:r>
-        <w:t xml:space="preserve">: </w:t>
-      </w:r>
-      <w:r>
-        <w:t xml:space="preserve">Diapositiva 3, Fuentes y cobertura de datos</w:t>
-      </w:r>
-    </w:p>
-    <w:p>
-      <w:r>
-        <w:rPr>
-          <w:b/>
-          <w:bCs/>
-        </w:rPr>
-        <w:t xml:space="preserve">Lucía:</w:t>
-      </w:r>
-      <w:r>
-        <w:t xml:space="preserve"> "</w:t>
-      </w:r>
-      <w:r>
-        <w:t xml:space="preserve">Todo viene de </w:t>
-      </w:r>
-      <w:r>
-        <w:rPr>
-          <w:b/>
-          <w:bCs/>
-        </w:rPr>
-        <w:t xml:space="preserve">datos abiertos</w:t>
-      </w:r>
-      <w:r>
-        <w:t xml:space="preserve">: información que las administraciones publican para que cualquiera la use. La cogemos de la Comunidad de Madrid, del INE, que es quien cuenta a la población, y del Consorcio de Transportes, el del metro y los autobuses. Un ordenador la lee solo, por internet.</w:t>
-      </w:r>
-      <w:r>
-        <w:t xml:space="preserve">"</w:t>
-      </w:r>
-    </w:p>
-    <w:p>
-      <w:r>
-        <w:rPr>
-          <w:b/>
-          <w:bCs/>
-        </w:rPr>
-        <w:t xml:space="preserve">Lucía:</w:t>
-      </w:r>
-      <w:r>
-        <w:t xml:space="preserve"> "</w:t>
-      </w:r>
-      <w:r>
-        <w:t xml:space="preserve">Y en la tabla ponemos también lo que </w:t>
-      </w:r>
-      <w:r>
-        <w:rPr>
-          <w:b/>
-          <w:bCs/>
-        </w:rPr>
-        <w:t xml:space="preserve">no sabemos</w:t>
-      </w:r>
-      <w:r>
-        <w:t xml:space="preserve">: por ejemplo, de quién es cada terreno, o cuánto se tarda en llegar por la calle. Preferimos decirlo antes que inventarlo.</w:t>
-      </w:r>
-      <w:r>
-        <w:t xml:space="preserve">"</w:t>
-      </w:r>
-    </w:p>
-    <w:p>
-      <w:r>
-        <w:rPr>
-          <w:b/>
-          <w:bCs/>
-        </w:rPr>
-        <w:t xml:space="preserve">Lucía:</w:t>
-      </w:r>
-      <w:r>
-        <w:t xml:space="preserve"> "</w:t>
-      </w:r>
-      <w:r>
-        <w:t xml:space="preserve">Además, encontramos </w:t>
-      </w:r>
-      <w:r>
-        <w:rPr>
-          <w:b/>
-          <w:bCs/>
-        </w:rPr>
-        <w:t xml:space="preserve">fallos en los datos oficiales</w:t>
-      </w:r>
-      <w:r>
-        <w:t xml:space="preserve">: centros de salud puestos en otra ciudad, o paradas de Ciudad Real con el código de un pueblo de Madrid. Los hemos arreglado, y podemos devolvérselos a la Comunidad.</w:t>
-      </w:r>
-      <w:r>
-        <w:t xml:space="preserve">"</w:t>
+        <w:t>PULSAR</w:t>
+      </w:r>
+      <w:r>
+        <w:t>: Diapositiva 3, Fuentes y cobertura de datos</w:t>
+      </w:r>
+    </w:p>
+    <w:p>
+      <w:r>
+        <w:rPr>
+          <w:b/>
+          <w:bCs/>
+        </w:rPr>
+        <w:t>Lucía:</w:t>
+      </w:r>
+      <w:r>
+        <w:t xml:space="preserve"> "Todo viene de </w:t>
+      </w:r>
+      <w:r>
+        <w:rPr>
+          <w:b/>
+          <w:bCs/>
+        </w:rPr>
+        <w:t>datos abiertos</w:t>
+      </w:r>
+      <w:r>
+        <w:t>: información que las administraciones publican para que cualquiera la use. La cogemos de la Comunidad de Madrid, del INE, que es quien cuenta a la población, y del Consorcio de Transportes, el del metro y los autobuses. Un ordenador la lee solo, por internet."</w:t>
+      </w:r>
+    </w:p>
+    <w:p>
+      <w:r>
+        <w:rPr>
+          <w:b/>
+          <w:bCs/>
+        </w:rPr>
+        <w:t>Lucía:</w:t>
+      </w:r>
+      <w:r>
+        <w:t xml:space="preserve"> "Y en la tabla ponemos también lo que </w:t>
+      </w:r>
+      <w:r>
+        <w:rPr>
+          <w:b/>
+          <w:bCs/>
+        </w:rPr>
+        <w:t>no sabemos</w:t>
+      </w:r>
+      <w:r>
+        <w:t>: por ejemplo, de quién es cada terreno, o cuánto se tarda en llegar por la calle. Preferimos decirlo antes que inventarlo."</w:t>
+      </w:r>
+    </w:p>
+    <w:p>
+      <w:r>
+        <w:rPr>
+          <w:b/>
+          <w:bCs/>
+        </w:rPr>
+        <w:t>Lucía:</w:t>
+      </w:r>
+      <w:r>
+        <w:t xml:space="preserve"> "Además, encontramos </w:t>
+      </w:r>
+      <w:r>
+        <w:rPr>
+          <w:b/>
+          <w:bCs/>
+        </w:rPr>
+        <w:t>fallos en los datos oficiales</w:t>
+      </w:r>
+      <w:r>
+        <w:t>: centros de salud puestos en otra ciudad, o paradas de Ciudad Real con el código de un pueblo de Madrid. Los hemos arreglado, y podemos devolvérselos a la Comunidad."</w:t>
       </w:r>
     </w:p>
     <w:p>
@@ -1707,13 +1592,10 @@
         <w:rPr>
           <w:color w:val="156082" w:themeColor="accent1"/>
         </w:rPr>
-        <w:t xml:space="preserve">PULSAR</w:t>
-      </w:r>
-      <w:r>
-        <w:t xml:space="preserve">: </w:t>
-      </w:r>
-      <w:r>
-        <w:t xml:space="preserve">(opcional, un segundo) pestaña Datos abiertos de la web: "y todo lo que hemos elaborado se puede descargar"</w:t>
+        <w:t>PULSAR</w:t>
+      </w:r>
+      <w:r>
+        <w:t>: (opcional, un segundo) pestaña Datos abiertos de la web: "y todo lo que hemos elaborado se puede descargar"</w:t>
       </w:r>
     </w:p>
     <w:p/>
@@ -1729,7 +1611,7 @@
           <w:b/>
           <w:bCs/>
         </w:rPr>
-        <w:t xml:space="preserve">7:25 – 8:40 · Cómo lo calculamos (diapositiva 4 · Claudia)</w:t>
+        <w:t>7:25 – 8:40 · Cómo lo calculamos (diapositiva 4 · Claudia)</w:t>
       </w:r>
     </w:p>
     <w:p>
@@ -1743,63 +1625,115 @@
         <w:rPr>
           <w:color w:val="156082" w:themeColor="accent1"/>
         </w:rPr>
-        <w:t xml:space="preserve">PULSAR</w:t>
-      </w:r>
-      <w:r>
-        <w:t xml:space="preserve">: </w:t>
-      </w:r>
-      <w:r>
-        <w:t xml:space="preserve">Diapositiva 4, Implementación técnica</w:t>
-      </w:r>
-    </w:p>
-    <w:p>
-      <w:r>
-        <w:rPr>
-          <w:b/>
-          <w:bCs/>
-        </w:rPr>
-        <w:t xml:space="preserve">Claudia:</w:t>
-      </w:r>
-      <w:r>
-        <w:t xml:space="preserve"> "</w:t>
-      </w:r>
-      <w:r>
-        <w:t xml:space="preserve">Hacemos </w:t>
-      </w:r>
-      <w:r>
-        <w:rPr>
-          <w:b/>
-          <w:bCs/>
-        </w:rPr>
-        <w:t xml:space="preserve">dos cuentas</w:t>
-      </w:r>
-      <w:r>
-        <w:t xml:space="preserve">.</w:t>
-      </w:r>
-      <w:r>
-        <w:t xml:space="preserve">"</w:t>
-      </w:r>
-    </w:p>
-    <w:p>
-      <w:r>
-        <w:rPr>
-          <w:b/>
-          <w:bCs/>
-        </w:rPr>
-        <w:t xml:space="preserve">Claudia:</w:t>
-      </w:r>
-      <w:r>
-        <w:t xml:space="preserve"> "</w:t>
-      </w:r>
-      <w:r>
-        <w:t xml:space="preserve">La </w:t>
-      </w:r>
-      <w:r>
-        <w:rPr>
-          <w:b/>
-          <w:bCs/>
-        </w:rPr>
-        <w:t xml:space="preserve">primera</w:t>
+        <w:t>PULSAR</w:t>
+      </w:r>
+      <w:r>
+        <w:t>: Diapositiva 4, Implementación técnica</w:t>
+      </w:r>
+    </w:p>
+    <w:p>
+      <w:r>
+        <w:t xml:space="preserve">Para pasar de los datos abiertos que estaban </w:t>
+      </w:r>
+      <w:proofErr w:type="spellStart"/>
+      <w:r>
+        <w:t>propuestaos</w:t>
+      </w:r>
+      <w:proofErr w:type="spellEnd"/>
+      <w:r>
+        <w:t xml:space="preserve"> en la comunidad de Madrid hemos pasado por siete cálculos: </w:t>
+      </w:r>
+      <w:proofErr w:type="spellStart"/>
+      <w:r>
+        <w:t>orimero</w:t>
+      </w:r>
+      <w:proofErr w:type="spellEnd"/>
+      <w:r>
+        <w:t xml:space="preserve"> para tener los centros, el </w:t>
+      </w:r>
+      <w:proofErr w:type="spellStart"/>
+      <w:r>
+        <w:t>padron</w:t>
+      </w:r>
+      <w:proofErr w:type="spellEnd"/>
+      <w:r>
+        <w:t xml:space="preserve"> y la </w:t>
+      </w:r>
+      <w:proofErr w:type="spellStart"/>
+      <w:r>
+        <w:t>natiladad</w:t>
+      </w:r>
+      <w:proofErr w:type="spellEnd"/>
+      <w:r>
+        <w:t xml:space="preserve">. Luego el planeamiento y el suelo. Luego a la </w:t>
+      </w:r>
+      <w:proofErr w:type="spellStart"/>
+      <w:r>
+        <w:t>ine</w:t>
+      </w:r>
+      <w:proofErr w:type="spellEnd"/>
+      <w:r>
+        <w:t xml:space="preserve"> para las secciones </w:t>
+      </w:r>
+      <w:r>
+        <w:lastRenderedPageBreak/>
+        <w:t xml:space="preserve">censales y ver cuanto porcentaje hay de cada rango de población, las zonas de salud. LA DEMANDA (COMO LA CALCULAMOS) Y por </w:t>
+      </w:r>
+      <w:proofErr w:type="spellStart"/>
+      <w:proofErr w:type="gramStart"/>
+      <w:r>
+        <w:t>ultimo</w:t>
+      </w:r>
+      <w:proofErr w:type="spellEnd"/>
+      <w:proofErr w:type="gramEnd"/>
+      <w:r>
+        <w:t xml:space="preserve"> una </w:t>
+      </w:r>
+      <w:proofErr w:type="spellStart"/>
+      <w:r>
+        <w:t>verificaicon</w:t>
+      </w:r>
+      <w:proofErr w:type="spellEnd"/>
+    </w:p>
+    <w:p>
+      <w:r>
+        <w:rPr>
+          <w:b/>
+          <w:bCs/>
+        </w:rPr>
+        <w:t>Claudia:</w:t>
+      </w:r>
+      <w:r>
+        <w:t xml:space="preserve"> "Hacemos </w:t>
+      </w:r>
+      <w:r>
+        <w:rPr>
+          <w:b/>
+          <w:bCs/>
+        </w:rPr>
+        <w:t>dos cuentas</w:t>
+      </w:r>
+      <w:r>
+        <w:t>."</w:t>
+      </w:r>
+    </w:p>
+    <w:p>
+      <w:r>
+        <w:rPr>
+          <w:b/>
+          <w:bCs/>
+        </w:rPr>
+        <w:t>Claudia:</w:t>
+      </w:r>
+      <w:r>
+        <w:t xml:space="preserve"> "La </w:t>
+      </w:r>
+      <w:r>
+        <w:rPr>
+          <w:b/>
+          <w:bCs/>
+        </w:rPr>
+        <w:t>primera</w:t>
       </w:r>
       <w:r>
         <w:t xml:space="preserve">: ¿cuánta gente va a vivir en un barrio? Es el número de casas por las personas que viven en cada casa. Ese número sale de un modelo sencillo que hemos enseñado con </w:t>
@@ -1809,35 +1743,29 @@
           <w:b/>
           <w:bCs/>
         </w:rPr>
-        <w:t xml:space="preserve">28 barrios</w:t>
-      </w:r>
-      <w:r>
-        <w:t xml:space="preserve"> que ya están habitados.</w:t>
-      </w:r>
-      <w:r>
-        <w:t xml:space="preserve">"</w:t>
-      </w:r>
-    </w:p>
-    <w:p>
-      <w:r>
-        <w:rPr>
-          <w:b/>
-          <w:bCs/>
-        </w:rPr>
-        <w:t xml:space="preserve">Claudia:</w:t>
-      </w:r>
-      <w:r>
-        <w:t xml:space="preserve"> "</w:t>
-      </w:r>
-      <w:r>
-        <w:t xml:space="preserve">¿Y acierta? Le hicimos un </w:t>
-      </w:r>
-      <w:r>
-        <w:rPr>
-          <w:b/>
-          <w:bCs/>
-        </w:rPr>
-        <w:t xml:space="preserve">examen sorpresa</w:t>
+        <w:t>28 barrios</w:t>
+      </w:r>
+      <w:r>
+        <w:t xml:space="preserve"> que ya están habitados."</w:t>
+      </w:r>
+    </w:p>
+    <w:p>
+      <w:r>
+        <w:rPr>
+          <w:b/>
+          <w:bCs/>
+        </w:rPr>
+        <w:t>Claudia:</w:t>
+      </w:r>
+      <w:r>
+        <w:t xml:space="preserve"> "¿Y acierta? Le hicimos un </w:t>
+      </w:r>
+      <w:r>
+        <w:rPr>
+          <w:b/>
+          <w:bCs/>
+        </w:rPr>
+        <w:t>examen sorpresa</w:t>
       </w:r>
       <w:r>
         <w:t xml:space="preserve">: tapamos un municipio entero, la web adivinó cuánta gente vivía allí, y lo comparamos con el dato real. Se equivoca de media un </w:t>
@@ -1847,7 +1775,7 @@
           <w:b/>
           <w:bCs/>
         </w:rPr>
-        <w:t xml:space="preserve">13 %</w:t>
+        <w:t>13 %</w:t>
       </w:r>
       <w:r>
         <w:t xml:space="preserve">. El método de siempre se equivoca un </w:t>
@@ -1857,7 +1785,7 @@
           <w:b/>
           <w:bCs/>
         </w:rPr>
-        <w:t xml:space="preserve">25 %</w:t>
+        <w:t>25 %</w:t>
       </w:r>
       <w:r>
         <w:t xml:space="preserve">: casi el doble. Y siempre damos un </w:t>
@@ -1867,7 +1795,7 @@
           <w:b/>
           <w:bCs/>
         </w:rPr>
-        <w:t xml:space="preserve">rango</w:t>
+        <w:t>rango</w:t>
       </w:r>
       <w:r>
         <w:t xml:space="preserve">, un “entre tanto y tanto”, que acierta </w:t>
@@ -1877,35 +1805,29 @@
           <w:b/>
           <w:bCs/>
         </w:rPr>
-        <w:t xml:space="preserve">8 de cada 10 veces</w:t>
-      </w:r>
-      <w:r>
-        <w:t xml:space="preserve">. Probamos a añadir más cosas y no mejoraba, así que lo dejamos sencillo para poder explicarlo.</w:t>
-      </w:r>
-      <w:r>
-        <w:t xml:space="preserve">"</w:t>
-      </w:r>
-    </w:p>
-    <w:p>
-      <w:r>
-        <w:rPr>
-          <w:b/>
-          <w:bCs/>
-        </w:rPr>
-        <w:t xml:space="preserve">Claudia:</w:t>
-      </w:r>
-      <w:r>
-        <w:t xml:space="preserve"> "</w:t>
-      </w:r>
-      <w:r>
-        <w:t xml:space="preserve">La </w:t>
-      </w:r>
-      <w:r>
-        <w:rPr>
-          <w:b/>
-          <w:bCs/>
-        </w:rPr>
-        <w:t xml:space="preserve">segunda</w:t>
+        <w:t>8 de cada 10 veces</w:t>
+      </w:r>
+      <w:r>
+        <w:t>. Probamos a añadir más cosas y no mejoraba, así que lo dejamos sencillo para poder explicarlo."</w:t>
+      </w:r>
+    </w:p>
+    <w:p>
+      <w:r>
+        <w:rPr>
+          <w:b/>
+          <w:bCs/>
+        </w:rPr>
+        <w:t>Claudia:</w:t>
+      </w:r>
+      <w:r>
+        <w:t xml:space="preserve"> "La </w:t>
+      </w:r>
+      <w:r>
+        <w:rPr>
+          <w:b/>
+          <w:bCs/>
+        </w:rPr>
+        <w:t>segunda</w:t>
       </w:r>
       <w:r>
         <w:t xml:space="preserve"> cuenta: ¿dónde ponemos el colegio? Buscamos terrenos vacíos que estén reservados para servicios. Elegimos el que le llega a más niños sin pasarse de sitio, y repetimos. Y siempre enseñamos </w:t>
@@ -1915,7 +1837,7 @@
           <w:b/>
           <w:bCs/>
         </w:rPr>
-        <w:t xml:space="preserve">tres sitios que hemos descartado</w:t>
+        <w:t>tres sitios que hemos descartado</w:t>
       </w:r>
       <w:r>
         <w:t xml:space="preserve">, y si el plan </w:t>
@@ -1925,13 +1847,10 @@
           <w:b/>
           <w:bCs/>
         </w:rPr>
-        <w:t xml:space="preserve">sigue valiendo</w:t>
-      </w:r>
-      <w:r>
-        <w:t xml:space="preserve"> aunque se hagan menos casas o se retrasen tres años.</w:t>
-      </w:r>
-      <w:r>
-        <w:t xml:space="preserve">"</w:t>
+        <w:t>sigue valiendo</w:t>
+      </w:r>
+      <w:r>
+        <w:t xml:space="preserve"> aunque se hagan menos casas o se retrasen tres años."</w:t>
       </w:r>
     </w:p>
     <w:p/>
@@ -1947,7 +1866,7 @@
           <w:b/>
           <w:bCs/>
         </w:rPr>
-        <w:t xml:space="preserve">8:40 – 9:20 · Lo que falta y lo que viene (diapositiva 5 · Lucía)</w:t>
+        <w:t>8:40 – 9:20 · Lo que falta y lo que viene (diapositiva 5 · Lucía)</w:t>
       </w:r>
     </w:p>
     <w:p>
@@ -1961,97 +1880,97 @@
         <w:rPr>
           <w:color w:val="156082" w:themeColor="accent1"/>
         </w:rPr>
-        <w:t xml:space="preserve">PULSAR</w:t>
-      </w:r>
-      <w:r>
-        <w:t xml:space="preserve">: </w:t>
-      </w:r>
-      <w:r>
-        <w:t xml:space="preserve">Diapositiva 5, Limitaciones y próximos pasos</w:t>
-      </w:r>
-    </w:p>
-    <w:p>
-      <w:r>
-        <w:rPr>
-          <w:b/>
-          <w:bCs/>
-        </w:rPr>
-        <w:t xml:space="preserve">Lucía:</w:t>
-      </w:r>
-      <w:r>
-        <w:t xml:space="preserve"> "</w:t>
-      </w:r>
-      <w:r>
-        <w:t xml:space="preserve">Os decimos también lo que </w:t>
-      </w:r>
-      <w:r>
-        <w:rPr>
-          <w:b/>
-          <w:bCs/>
-        </w:rPr>
-        <w:t xml:space="preserve">todavía no hacemos bien</w:t>
-      </w:r>
-      <w:r>
-        <w:t xml:space="preserve">. Medimos las distancias en línea recta, como si volaras, y no por las calles. Los terrenos públicos los deducimos del plan urbanístico, y los marcamos como “por confirmar”. Y el acceso de técnicos es de prueba.</w:t>
-      </w:r>
-      <w:r>
-        <w:t xml:space="preserve">"</w:t>
-      </w:r>
-    </w:p>
-    <w:p>
-      <w:r>
-        <w:rPr>
-          <w:b/>
-          <w:bCs/>
-        </w:rPr>
-        <w:t xml:space="preserve">Lucía:</w:t>
-      </w:r>
-      <w:r>
-        <w:t xml:space="preserve"> "</w:t>
-      </w:r>
-      <w:r>
-        <w:t xml:space="preserve">Lo siguiente: saber qué colegios </w:t>
-      </w:r>
-      <w:r>
-        <w:rPr>
-          <w:b/>
-          <w:bCs/>
-        </w:rPr>
-        <w:t xml:space="preserve">ya se están construyendo</w:t>
-      </w:r>
-      <w:r>
-        <w:t xml:space="preserve">, medir andando por las calles, y probarlo con los ayuntamientos.</w:t>
-      </w:r>
-      <w:r>
-        <w:t xml:space="preserve">"</w:t>
-      </w:r>
-    </w:p>
-    <w:p>
-      <w:r>
-        <w:rPr>
-          <w:b/>
-          <w:bCs/>
-        </w:rPr>
-        <w:t xml:space="preserve">Lucía:</w:t>
-      </w:r>
-      <w:r>
-        <w:t xml:space="preserve"> "</w:t>
-      </w:r>
-      <w:r>
-        <w:t xml:space="preserve">Y lo mejor: </w:t>
-      </w:r>
-      <w:r>
-        <w:rPr>
-          <w:b/>
-          <w:bCs/>
-        </w:rPr>
-        <w:t xml:space="preserve">ya funciona hoy</w:t>
-      </w:r>
-      <w:r>
-        <w:t xml:space="preserve">. Está publicado en internet, vale para cualquier municipio, y con un solo comando se actualiza con datos nuevos. No cuesta nada: datos abiertos y software libre.</w:t>
-      </w:r>
-      <w:r>
-        <w:t xml:space="preserve">"</w:t>
+        <w:t>PULSAR</w:t>
+      </w:r>
+      <w:r>
+        <w:t>: Diapositiva 5, Limitaciones y próximos pasos</w:t>
+      </w:r>
+    </w:p>
+    <w:p>
+      <w:r>
+        <w:rPr>
+          <w:b/>
+          <w:bCs/>
+        </w:rPr>
+        <w:t>Claudia</w:t>
+      </w:r>
+      <w:r>
+        <w:rPr>
+          <w:b/>
+          <w:bCs/>
+        </w:rPr>
+        <w:t>:</w:t>
+      </w:r>
+      <w:r>
+        <w:t xml:space="preserve"> "Os decimos también lo que </w:t>
+      </w:r>
+      <w:r>
+        <w:rPr>
+          <w:b/>
+          <w:bCs/>
+        </w:rPr>
+        <w:t>todavía no hacemos bien</w:t>
+      </w:r>
+      <w:r>
+        <w:t>. Medimos las distancias en línea recta, como si volaras, y no por las calles. Los terrenos públicos los deducimos del plan urbanístico, y los marcamos como “por confirmar”. Y el acceso de técnicos es de prueba."</w:t>
+      </w:r>
+    </w:p>
+    <w:p>
+      <w:r>
+        <w:rPr>
+          <w:b/>
+          <w:bCs/>
+        </w:rPr>
+        <w:t>Claudia</w:t>
+      </w:r>
+      <w:r>
+        <w:rPr>
+          <w:b/>
+          <w:bCs/>
+        </w:rPr>
+        <w:t>:</w:t>
+      </w:r>
+      <w:r>
+        <w:t xml:space="preserve"> "Lo siguiente: saber qué colegios </w:t>
+      </w:r>
+      <w:r>
+        <w:rPr>
+          <w:b/>
+          <w:bCs/>
+        </w:rPr>
+        <w:t>ya se están construyendo</w:t>
+      </w:r>
+      <w:r>
+        <w:t>, medir andando por las calles, y probarlo con los ayuntamientos."</w:t>
+      </w:r>
+    </w:p>
+    <w:p>
+      <w:r>
+        <w:rPr>
+          <w:b/>
+          <w:bCs/>
+        </w:rPr>
+        <w:t>Claudia</w:t>
+      </w:r>
+      <w:r>
+        <w:rPr>
+          <w:b/>
+          <w:bCs/>
+        </w:rPr>
+        <w:t>:</w:t>
+      </w:r>
+      <w:r>
+        <w:t xml:space="preserve"> "Y lo mejor: </w:t>
+      </w:r>
+      <w:r>
+        <w:rPr>
+          <w:b/>
+          <w:bCs/>
+        </w:rPr>
+        <w:t>ya funciona hoy</w:t>
+      </w:r>
+      <w:r>
+        <w:t>. Está publicado en internet, vale para cualquier municipio, y con un solo comando se actualiza con datos nuevos. No cuesta nada: datos abiertos y software libre."</w:t>
       </w:r>
     </w:p>
     <w:p/>
@@ -2067,7 +1986,7 @@
           <w:b/>
           <w:bCs/>
         </w:rPr>
-        <w:t xml:space="preserve">9:20 – 10:00 · Cierre (diapositiva 6 · las dos)</w:t>
+        <w:t>9:20 – 10:00 · Cierre (diapositiva 6 · las dos)</w:t>
       </w:r>
     </w:p>
     <w:p>
@@ -2081,187 +2000,84 @@
         <w:rPr>
           <w:color w:val="156082" w:themeColor="accent1"/>
         </w:rPr>
-        <w:t xml:space="preserve">PULSAR</w:t>
-      </w:r>
-      <w:r>
-        <w:t xml:space="preserve">: </w:t>
-      </w:r>
-      <w:r>
-        <w:t xml:space="preserve">Diapositiva 6, ¿Preguntas?</w:t>
-      </w:r>
-    </w:p>
-    <w:p>
-      <w:r>
-        <w:rPr>
-          <w:b/>
-          <w:bCs/>
-        </w:rPr>
-        <w:t xml:space="preserve">Lucía:</w:t>
-      </w:r>
-      <w:r>
-        <w:t xml:space="preserve"> "</w:t>
-      </w:r>
-      <w:r>
-        <w:t xml:space="preserve">Los demás te dicen dónde vivir hoy. </w:t>
-      </w:r>
-      <w:r>
-        <w:rPr>
-          <w:b/>
-          <w:bCs/>
-        </w:rPr>
-        <w:t xml:space="preserve">Cuna y Canas te dice qué va a faltar mañana, y dónde ponerlo.</w:t>
-      </w:r>
-      <w:r>
-        <w:t xml:space="preserve"> De la cuna…</w:t>
-      </w:r>
-      <w:r>
-        <w:t xml:space="preserve">"</w:t>
-      </w:r>
-    </w:p>
-    <w:p>
-      <w:r>
-        <w:rPr>
-          <w:b/>
-          <w:bCs/>
-        </w:rPr>
-        <w:t xml:space="preserve">Claudia:</w:t>
-      </w:r>
-      <w:r>
-        <w:t xml:space="preserve"> "</w:t>
-      </w:r>
-      <w:r>
-        <w:t xml:space="preserve">…a las canas.</w:t>
-      </w:r>
-      <w:r>
-        <w:t xml:space="preserve">"</w:t>
-      </w:r>
-    </w:p>
-    <w:p>
-      <w:r>
-        <w:rPr>
-          <w:b/>
-          <w:bCs/>
-        </w:rPr>
-        <w:t xml:space="preserve">Las dos:</w:t>
-      </w:r>
-      <w:r>
-        <w:t xml:space="preserve"> "</w:t>
-      </w:r>
-      <w:r>
-        <w:t xml:space="preserve">Que la próxima vez, cuando lleguen las familias, </w:t>
-      </w:r>
-      <w:r>
-        <w:rPr>
-          <w:b/>
-          <w:bCs/>
-        </w:rPr>
-        <w:t xml:space="preserve">el colegio ya esté esperándolas</w:t>
-      </w:r>
-      <w:r>
-        <w:t xml:space="preserve">… y el hogar de mayores, con el dominó listo. Gracias.</w:t>
-      </w:r>
-      <w:r>
-        <w:t xml:space="preserve">"</w:t>
+        <w:t>PULSAR</w:t>
+      </w:r>
+      <w:r>
+        <w:t>: Diapositiva 6, ¿Preguntas?</w:t>
+      </w:r>
+    </w:p>
+    <w:p>
+      <w:r>
+        <w:rPr>
+          <w:b/>
+          <w:bCs/>
+        </w:rPr>
+        <w:t>Claudia</w:t>
+      </w:r>
+      <w:r>
+        <w:rPr>
+          <w:b/>
+          <w:bCs/>
+        </w:rPr>
+        <w:t>:</w:t>
+      </w:r>
+      <w:r>
+        <w:t xml:space="preserve"> "Los demás te dicen dónde vivir hoy. </w:t>
+      </w:r>
+      <w:r>
+        <w:rPr>
+          <w:b/>
+          <w:bCs/>
+        </w:rPr>
+        <w:t>Cuna y Canas te dice qué va a faltar mañana, y dónde ponerlo.</w:t>
+      </w:r>
+      <w:r>
+        <w:t xml:space="preserve"> De la cuna…"</w:t>
+      </w:r>
+    </w:p>
+    <w:p>
+      <w:r>
+        <w:rPr>
+          <w:b/>
+          <w:bCs/>
+        </w:rPr>
+        <w:lastRenderedPageBreak/>
+        <w:t>Claudia:</w:t>
+      </w:r>
+      <w:r>
+        <w:t> "…a las canas."</w:t>
+      </w:r>
+    </w:p>
+    <w:p>
+      <w:r>
+        <w:rPr>
+          <w:b/>
+          <w:bCs/>
+        </w:rPr>
+        <w:t>Claudia</w:t>
+      </w:r>
+      <w:r>
+        <w:rPr>
+          <w:b/>
+          <w:bCs/>
+        </w:rPr>
+        <w:t>:</w:t>
+      </w:r>
+      <w:r>
+        <w:t xml:space="preserve"> "Que la próxima vez, cuando lleguen las familias, </w:t>
+      </w:r>
+      <w:r>
+        <w:rPr>
+          <w:b/>
+          <w:bCs/>
+        </w:rPr>
+        <w:t>el colegio ya esté esperándolas</w:t>
+      </w:r>
+      <w:r>
+        <w:t>… y el hogar de mayores, con el dominó listo. Gracias."</w:t>
       </w:r>
     </w:p>
     <w:p/>
-    <w:p>
-      <w:pPr>
-        <w:rPr>
-          <w:b/>
-          <w:bCs/>
-        </w:rPr>
-      </w:pPr>
-      <w:r>
-        <w:rPr>
-          <w:b/>
-          <w:bCs/>
-        </w:rPr>
-        <w:t xml:space="preserve">AVISO PARA LAS DIAPOSITIVAS (cifras que hay que cambiar)</w:t>
-      </w:r>
-    </w:p>
-    <w:p>
-      <w:r>
-        <w:t xml:space="preserve">La diapositiva 1 todavía lleva cifras del modelo antiguo, que ya no coinciden con la web:</w:t>
-      </w:r>
-    </w:p>
-    <w:p>
-      <w:pPr>
-        <w:numPr>
-          <w:ilvl w:val="0"/>
-          <w:numId w:val="1"/>
-        </w:numPr>
-      </w:pPr>
-      <w:r>
-        <w:t xml:space="preserve">"1,08–1,53 M personas" → </w:t>
-      </w:r>
-      <w:r>
-        <w:rPr>
-          <w:b/>
-          <w:bCs/>
-        </w:rPr>
-        <w:t xml:space="preserve">0,5–0,7 millones</w:t>
-      </w:r>
-    </w:p>
-    <w:p>
-      <w:pPr>
-        <w:numPr>
-          <w:ilvl w:val="0"/>
-          <w:numId w:val="1"/>
-        </w:numPr>
-      </w:pPr>
-      <w:r>
-        <w:t xml:space="preserve">"88–214 mil plazas de colegio" → </w:t>
-      </w:r>
-      <w:r>
-        <w:rPr>
-          <w:b/>
-          <w:bCs/>
-        </w:rPr>
-        <w:t xml:space="preserve">38.000–93.000</w:t>
-      </w:r>
-    </w:p>
-    <w:p>
-      <w:pPr>
-        <w:numPr>
-          <w:ilvl w:val="0"/>
-          <w:numId w:val="1"/>
-        </w:numPr>
-      </w:pPr>
-      <w:r>
-        <w:t xml:space="preserve">"43–61 centros de salud" → </w:t>
-      </w:r>
-      <w:r>
-        <w:rPr>
-          <w:b/>
-          <w:bCs/>
-        </w:rPr>
-        <w:t xml:space="preserve">19–27</w:t>
-      </w:r>
-    </w:p>
-    <w:p>
-      <w:pPr>
-        <w:numPr>
-          <w:ilvl w:val="0"/>
-          <w:numId w:val="1"/>
-        </w:numPr>
-      </w:pPr>
-      <w:r>
-        <w:t xml:space="preserve">Añadir (o sustituir "513.000+" por): 513.000 viviendas previstas, de las que </w:t>
-      </w:r>
-      <w:r>
-        <w:rPr>
-          <w:b/>
-          <w:bCs/>
-        </w:rPr>
-        <w:t xml:space="preserve">222.000 aún sin construir</w:t>
-      </w:r>
-    </w:p>
-    <w:p>
-      <w:r>
-        <w:t xml:space="preserve">Las diapositivas 3, 4 y 5 ya coinciden con lo que dice este texto (179 / 144, error 13,1 % frente a 25,1 %, 79 %, 28 barrios de 17 municipios).</w:t>
-      </w:r>
-    </w:p>
     <w:sectPr>
       <w:pgSz w:w="11906" w:h="16838"/>
       <w:pgMar w:top="1417" w:right="1701" w:bottom="1417" w:left="1701" w:header="708" w:footer="708" w:gutter="0"/>
@@ -3033,6 +2849,7 @@
   <w:style w:type="character" w:default="1" w:styleId="Fuentedeprrafopredeter">
     <w:name w:val="Default Paragraph Font"/>
     <w:uiPriority w:val="1"/>
+    <w:semiHidden/>
     <w:unhideWhenUsed/>
   </w:style>
   <w:style w:type="table" w:default="1" w:styleId="Tablanormal">

</xml_diff>